<commit_message>
deal screen: update ollin.docx
</commit_message>
<xml_diff>
--- a/hub/static/research/companies/ollin.docx
+++ b/hub/static/research/companies/ollin.docx
@@ -3,20 +3,23 @@
 <w:document xmlns:wpc="http://schemas.microsoft.com/office/word/2010/wordprocessingCanvas" xmlns:mo="http://schemas.microsoft.com/office/mac/office/2008/main" xmlns:mc="http://schemas.openxmlformats.org/markup-compatibility/2006" xmlns:mv="urn:schemas-microsoft-com:mac:vml" xmlns:o="urn:schemas-microsoft-com:office:office" xmlns:r="http://schemas.openxmlformats.org/officeDocument/2006/relationships" xmlns:m="http://schemas.openxmlformats.org/officeDocument/2006/math" xmlns:v="urn:schemas-microsoft-com:vml" xmlns:wp14="http://schemas.microsoft.com/office/word/2010/wordprocessingDrawing" xmlns:wp="http://schemas.openxmlformats.org/drawingml/2006/wordprocessingDrawing" xmlns:w10="urn:schemas-microsoft-com:office:word" xmlns:w="http://schemas.openxmlformats.org/wordprocessingml/2006/main" xmlns:w14="http://schemas.microsoft.com/office/word/2010/wordml" xmlns:wpg="http://schemas.microsoft.com/office/word/2010/wordprocessingGroup" xmlns:wpi="http://schemas.microsoft.com/office/word/2010/wordprocessingInk" xmlns:wne="http://schemas.microsoft.com/office/word/2006/wordml" xmlns:wps="http://schemas.microsoft.com/office/word/2010/wordprocessingShape" mc:Ignorable="w14 wp14">
   <w:body>
     <w:p>
+      <w:pPr>
+        <w:spacing w:before="80" w:after="40"/>
+      </w:pPr>
       <w:r>
         <w:rPr>
           <w:rFonts w:ascii="Roboto Serif" w:hAnsi="Roboto Serif"/>
           <w:b/>
           <w:caps w:val="0"/>
           <w:color w:val="1A1A1A"/>
-          <w:sz w:val="48"/>
+          <w:sz w:val="44"/>
         </w:rPr>
         <w:t>Ollin</w:t>
       </w:r>
     </w:p>
     <w:p>
       <w:pPr>
-        <w:spacing w:after="80"/>
+        <w:spacing w:after="40"/>
       </w:pPr>
       <w:r>
         <w:rPr>
@@ -24,18 +27,10 @@
           <w:b w:val="0"/>
           <w:caps w:val="0"/>
           <w:color w:val="828282"/>
-          <w:sz w:val="22"/>
+          <w:sz w:val="21"/>
         </w:rPr>
-        <w:t>ollin.bio   ·   Series B   ·   Austin, TX   ·   ARCH Venture Partners, TCG Crossover Management</w:t>
+        <w:t>ollin.bio   ·   Series B   ·   Austin, TX   ·   ARCH Venture Partners, TCG Crossover Management(Cariad Chester)</w:t>
       </w:r>
-    </w:p>
-    <w:p>
-      <w:pPr>
-        <w:spacing w:after="320"/>
-        <w:pBdr>
-          <w:bottom w:val="single" w:sz="6" w:color="1A1A1A" w:space="4"/>
-        </w:pBdr>
-      </w:pPr>
     </w:p>
     <w:p>
       <w:pPr>
@@ -43,13 +38,46 @@
       </w:pPr>
       <w:r>
         <w:rPr>
+          <w:rFonts w:ascii="Sora" w:hAnsi="Sora"/>
+          <w:b w:val="0"/>
+          <w:caps w:val="0"/>
+          <w:color w:val="828282"/>
+          <w:sz w:val="18"/>
+        </w:rPr>
+        <w:t>Screened 2026-06-29</w:t>
+      </w:r>
+    </w:p>
+    <w:p>
+      <w:pPr>
+        <w:spacing w:after="120"/>
+        <w:pBdr>
+          <w:bottom w:val="single" w:sz="6" w:color="1A1A1A" w:space="4"/>
+        </w:pBdr>
+      </w:pPr>
+      <w:r>
+        <w:rPr>
           <w:rFonts w:ascii="Roboto Serif" w:hAnsi="Roboto Serif"/>
           <w:b/>
           <w:caps w:val="0"/>
           <w:color w:val="1A1A1A"/>
-          <w:sz w:val="30"/>
+          <w:sz w:val="28"/>
         </w:rPr>
-        <w:t>Fit score 2.0 / 4.0</w:t>
+        <w:t>FIT ASSESSMENT</w:t>
+      </w:r>
+    </w:p>
+    <w:p>
+      <w:pPr>
+        <w:spacing w:before="120" w:after="240"/>
+      </w:pPr>
+      <w:r>
+        <w:rPr>
+          <w:rFonts w:ascii="Roboto Serif" w:hAnsi="Roboto Serif"/>
+          <w:b/>
+          <w:caps w:val="0"/>
+          <w:color w:val="1A1A1A"/>
+          <w:sz w:val="32"/>
+        </w:rPr>
+        <w:t>1.8 / 4.0</w:t>
       </w:r>
       <w:r>
         <w:rPr>
@@ -69,20 +97,21 @@
         <w:tblLook w:firstColumn="1" w:firstRow="1" w:lastColumn="0" w:lastRow="0" w:noHBand="0" w:noVBand="1" w:val="04A0"/>
       </w:tblPr>
       <w:tblGrid>
-        <w:gridCol w:w="3216"/>
-        <w:gridCol w:w="3216"/>
-        <w:gridCol w:w="3216"/>
+        <w:gridCol w:w="3120"/>
+        <w:gridCol w:w="3120"/>
+        <w:gridCol w:w="3120"/>
       </w:tblGrid>
       <w:tr>
         <w:tc>
           <w:tcPr>
-            <w:tcW w:type="dxa" w:w="2736"/>
-            <w:tcBorders>
-              <w:top w:val="nil"/>
-              <w:left w:val="nil"/>
-              <w:right w:val="nil"/>
-              <w:bottom w:val="single" w:sz="8" w:color="1A1A1A"/>
-            </w:tcBorders>
+            <w:tcW w:type="dxa" w:w="2664"/>
+            <w:shd w:val="clear" w:color="auto" w:fill="1A1A1A"/>
+            <w:tcMar>
+              <w:top w:w="40" w:type="dxa"/>
+              <w:bottom w:w="40" w:type="dxa"/>
+              <w:left w:w="60" w:type="dxa"/>
+              <w:right w:w="60" w:type="dxa"/>
+            </w:tcMar>
           </w:tcPr>
           <w:p>
             <w:r>
@@ -90,8 +119,8 @@
                 <w:rFonts w:ascii="Sora" w:hAnsi="Sora"/>
                 <w:b/>
                 <w:caps/>
-                <w:color w:val="1A1A1A"/>
-                <w:sz w:val="17"/>
+                <w:color w:val="FFFFFF"/>
+                <w:sz w:val="18"/>
               </w:rPr>
               <w:t>Dimension</w:t>
             </w:r>
@@ -99,13 +128,14 @@
         </w:tc>
         <w:tc>
           <w:tcPr>
-            <w:tcW w:type="dxa" w:w="864"/>
-            <w:tcBorders>
-              <w:top w:val="nil"/>
-              <w:left w:val="nil"/>
-              <w:right w:val="nil"/>
-              <w:bottom w:val="single" w:sz="8" w:color="1A1A1A"/>
-            </w:tcBorders>
+            <w:tcW w:type="dxa" w:w="792"/>
+            <w:shd w:val="clear" w:color="auto" w:fill="1A1A1A"/>
+            <w:tcMar>
+              <w:top w:w="40" w:type="dxa"/>
+              <w:bottom w:w="40" w:type="dxa"/>
+              <w:left w:w="60" w:type="dxa"/>
+              <w:right w:w="60" w:type="dxa"/>
+            </w:tcMar>
           </w:tcPr>
           <w:p>
             <w:r>
@@ -113,8 +143,8 @@
                 <w:rFonts w:ascii="Sora" w:hAnsi="Sora"/>
                 <w:b/>
                 <w:caps/>
-                <w:color w:val="1A1A1A"/>
-                <w:sz w:val="17"/>
+                <w:color w:val="FFFFFF"/>
+                <w:sz w:val="18"/>
               </w:rPr>
               <w:t>Score</w:t>
             </w:r>
@@ -122,13 +152,14 @@
         </w:tc>
         <w:tc>
           <w:tcPr>
-            <w:tcW w:type="dxa" w:w="6336"/>
-            <w:tcBorders>
-              <w:top w:val="nil"/>
-              <w:left w:val="nil"/>
-              <w:right w:val="nil"/>
-              <w:bottom w:val="single" w:sz="8" w:color="1A1A1A"/>
-            </w:tcBorders>
+            <w:tcW w:type="dxa" w:w="5904"/>
+            <w:shd w:val="clear" w:color="auto" w:fill="1A1A1A"/>
+            <w:tcMar>
+              <w:top w:w="40" w:type="dxa"/>
+              <w:bottom w:w="40" w:type="dxa"/>
+              <w:left w:w="60" w:type="dxa"/>
+              <w:right w:w="60" w:type="dxa"/>
+            </w:tcMar>
           </w:tcPr>
           <w:p>
             <w:r>
@@ -136,8 +167,8 @@
                 <w:rFonts w:ascii="Sora" w:hAnsi="Sora"/>
                 <w:b/>
                 <w:caps/>
-                <w:color w:val="1A1A1A"/>
-                <w:sz w:val="17"/>
+                <w:color w:val="FFFFFF"/>
+                <w:sz w:val="18"/>
               </w:rPr>
               <w:t>Evidence</w:t>
             </w:r>
@@ -147,7 +178,14 @@
       <w:tr>
         <w:tc>
           <w:tcPr>
-            <w:tcW w:type="dxa" w:w="2736"/>
+            <w:tcW w:type="dxa" w:w="2664"/>
+            <w:shd w:val="clear" w:color="auto" w:fill="F5F5F5"/>
+            <w:tcMar>
+              <w:top w:w="40" w:type="dxa"/>
+              <w:bottom w:w="40" w:type="dxa"/>
+              <w:left w:w="60" w:type="dxa"/>
+              <w:right w:w="60" w:type="dxa"/>
+            </w:tcMar>
             <w:tcBorders>
               <w:top w:val="nil"/>
               <w:left w:val="nil"/>
@@ -170,7 +208,14 @@
         </w:tc>
         <w:tc>
           <w:tcPr>
-            <w:tcW w:type="dxa" w:w="864"/>
+            <w:tcW w:type="dxa" w:w="792"/>
+            <w:shd w:val="clear" w:color="auto" w:fill="F5F5F5"/>
+            <w:tcMar>
+              <w:top w:w="40" w:type="dxa"/>
+              <w:bottom w:w="40" w:type="dxa"/>
+              <w:left w:w="60" w:type="dxa"/>
+              <w:right w:w="60" w:type="dxa"/>
+            </w:tcMar>
             <w:tcBorders>
               <w:top w:val="nil"/>
               <w:left w:val="nil"/>
@@ -182,18 +227,35 @@
             <w:r>
               <w:rPr>
                 <w:rFonts w:ascii="Sora" w:hAnsi="Sora"/>
-                <w:b w:val="0"/>
+                <w:b/>
                 <w:caps w:val="0"/>
                 <w:color w:val="1A1A1A"/>
                 <w:sz w:val="19"/>
               </w:rPr>
               <w:t>3</w:t>
             </w:r>
+            <w:r>
+              <w:rPr>
+                <w:rFonts w:ascii="Sora" w:hAnsi="Sora"/>
+                <w:b w:val="0"/>
+                <w:caps w:val="0"/>
+                <w:color w:val="828282"/>
+                <w:sz w:val="17"/>
+              </w:rPr>
+              <w:t xml:space="preserve"> / 4</w:t>
+            </w:r>
           </w:p>
         </w:tc>
         <w:tc>
           <w:tcPr>
-            <w:tcW w:type="dxa" w:w="6336"/>
+            <w:tcW w:type="dxa" w:w="5904"/>
+            <w:shd w:val="clear" w:color="auto" w:fill="F5F5F5"/>
+            <w:tcMar>
+              <w:top w:w="40" w:type="dxa"/>
+              <w:bottom w:w="40" w:type="dxa"/>
+              <w:left w:w="60" w:type="dxa"/>
+              <w:right w:w="60" w:type="dxa"/>
+            </w:tcMar>
             <w:tcBorders>
               <w:top w:val="nil"/>
               <w:left w:val="nil"/>
@@ -210,47 +272,7 @@
                 <w:color w:val="3C3C3C"/>
                 <w:sz w:val="18"/>
               </w:rPr>
-              <w:t xml:space="preserve">Ollin Biosciences, an Austin, Texas–based biotech, raised an oversubscribed $330M Series B round co-led by </w:t>
-            </w:r>
-            <w:r>
-              <w:rPr>
-                <w:rFonts w:ascii="Sora" w:hAnsi="Sora"/>
-                <w:b/>
-                <w:caps w:val="0"/>
-                <w:color w:val="3C3C3C"/>
-                <w:sz w:val="18"/>
-              </w:rPr>
-              <w:t>new investor TCGX</w:t>
-            </w:r>
-            <w:r>
-              <w:rPr>
-                <w:rFonts w:ascii="Sora" w:hAnsi="Sora"/>
-                <w:b w:val="0"/>
-                <w:caps w:val="0"/>
-                <w:color w:val="3C3C3C"/>
-                <w:sz w:val="18"/>
-              </w:rPr>
-              <w:t xml:space="preserve"> and </w:t>
-            </w:r>
-            <w:r>
-              <w:rPr>
-                <w:rFonts w:ascii="Sora" w:hAnsi="Sora"/>
-                <w:b/>
-                <w:caps w:val="0"/>
-                <w:color w:val="3C3C3C"/>
-                <w:sz w:val="18"/>
-              </w:rPr>
-              <w:t>founding investor ARCH Venture Partners</w:t>
-            </w:r>
-            <w:r>
-              <w:rPr>
-                <w:rFonts w:ascii="Sora" w:hAnsi="Sora"/>
-                <w:b w:val="0"/>
-                <w:caps w:val="0"/>
-                <w:color w:val="3C3C3C"/>
-                <w:sz w:val="18"/>
-              </w:rPr>
-              <w:t>, with a broad top-tier healthcare crossover syndicate including a16z Bio+Health, Blackstone, RA Capital, CPP Investments, and T. Rowe Price.[2][3][5] This is a primary, new-money Series B with at least one Tier 1 lead (TCGX) joining the cap table for the first time, but ARCH is an inside co-lead, so it fits the 'near–top-tier new-money Series B+, top-tier syndicate' band rather than the pure new-money top-tier lead ideal.[3][5]</w:t>
+              <w:t>Ollin Biosciences raised an oversubscribed $330M Series B financing co-led by ARCH Venture Partners and TCGX (TCG Crossover). ARCH is a founding/inside investor, while TCGX is a new investor joining the cap table, and the round includes a top-tier syndicate (T. Rowe Price accounts, Blackstone Multi-Asset Investing, RA Capital, Monograph Capital). This fits a near–top-tier new-money Series B+ with a top-tier syndicate, but not a clean single new-money Tier 1 lead, so Score 3 vs 4.[1][3][4][6]</w:t>
             </w:r>
           </w:p>
         </w:tc>
@@ -258,7 +280,14 @@
       <w:tr>
         <w:tc>
           <w:tcPr>
-            <w:tcW w:type="dxa" w:w="2736"/>
+            <w:tcW w:type="dxa" w:w="2664"/>
+            <w:shd w:val="clear" w:color="auto" w:fill="FFFFFF"/>
+            <w:tcMar>
+              <w:top w:w="40" w:type="dxa"/>
+              <w:bottom w:w="40" w:type="dxa"/>
+              <w:left w:w="60" w:type="dxa"/>
+              <w:right w:w="60" w:type="dxa"/>
+            </w:tcMar>
             <w:tcBorders>
               <w:top w:val="nil"/>
               <w:left w:val="nil"/>
@@ -281,7 +310,14 @@
         </w:tc>
         <w:tc>
           <w:tcPr>
-            <w:tcW w:type="dxa" w:w="864"/>
+            <w:tcW w:type="dxa" w:w="792"/>
+            <w:shd w:val="clear" w:color="auto" w:fill="FFFFFF"/>
+            <w:tcMar>
+              <w:top w:w="40" w:type="dxa"/>
+              <w:bottom w:w="40" w:type="dxa"/>
+              <w:left w:w="60" w:type="dxa"/>
+              <w:right w:w="60" w:type="dxa"/>
+            </w:tcMar>
             <w:tcBorders>
               <w:top w:val="nil"/>
               <w:left w:val="nil"/>
@@ -293,18 +329,35 @@
             <w:r>
               <w:rPr>
                 <w:rFonts w:ascii="Sora" w:hAnsi="Sora"/>
-                <w:b w:val="0"/>
+                <w:b/>
                 <w:caps w:val="0"/>
                 <w:color w:val="1A1A1A"/>
                 <w:sz w:val="19"/>
               </w:rPr>
               <w:t>1</w:t>
             </w:r>
+            <w:r>
+              <w:rPr>
+                <w:rFonts w:ascii="Sora" w:hAnsi="Sora"/>
+                <w:b w:val="0"/>
+                <w:caps w:val="0"/>
+                <w:color w:val="828282"/>
+                <w:sz w:val="17"/>
+              </w:rPr>
+              <w:t xml:space="preserve"> / 4</w:t>
+            </w:r>
           </w:p>
         </w:tc>
         <w:tc>
           <w:tcPr>
-            <w:tcW w:type="dxa" w:w="6336"/>
+            <w:tcW w:type="dxa" w:w="5904"/>
+            <w:shd w:val="clear" w:color="auto" w:fill="FFFFFF"/>
+            <w:tcMar>
+              <w:top w:w="40" w:type="dxa"/>
+              <w:bottom w:w="40" w:type="dxa"/>
+              <w:left w:w="60" w:type="dxa"/>
+              <w:right w:w="60" w:type="dxa"/>
+            </w:tcMar>
             <w:tcBorders>
               <w:top w:val="nil"/>
               <w:left w:val="nil"/>
@@ -321,67 +374,7 @@
                 <w:color w:val="3C3C3C"/>
                 <w:sz w:val="18"/>
               </w:rPr>
-              <w:t xml:space="preserve">Ollin is described as a </w:t>
-            </w:r>
-            <w:r>
-              <w:rPr>
-                <w:rFonts w:ascii="Sora" w:hAnsi="Sora"/>
-                <w:b/>
-                <w:caps w:val="0"/>
-                <w:color w:val="3C3C3C"/>
-                <w:sz w:val="18"/>
-              </w:rPr>
-              <w:t>clinical-stage biotech</w:t>
-            </w:r>
-            <w:r>
-              <w:rPr>
-                <w:rFonts w:ascii="Sora" w:hAnsi="Sora"/>
-                <w:b w:val="0"/>
-                <w:caps w:val="0"/>
-                <w:color w:val="3C3C3C"/>
-                <w:sz w:val="18"/>
-              </w:rPr>
-              <w:t xml:space="preserve"> advancing best-in-disease therapies for vision-threatening diseases, with its lead asset OLN324 a next-generation </w:t>
-            </w:r>
-            <w:r>
-              <w:rPr>
-                <w:rFonts w:ascii="Sora" w:hAnsi="Sora"/>
-                <w:b/>
-                <w:caps w:val="0"/>
-                <w:color w:val="3C3C3C"/>
-                <w:sz w:val="18"/>
-              </w:rPr>
-              <w:t>VEGF/Ang2 bispecific antibody</w:t>
-            </w:r>
-            <w:r>
-              <w:rPr>
-                <w:rFonts w:ascii="Sora" w:hAnsi="Sora"/>
-                <w:b w:val="0"/>
-                <w:caps w:val="0"/>
-                <w:color w:val="3C3C3C"/>
-                <w:sz w:val="18"/>
-              </w:rPr>
-              <w:t xml:space="preserve"> for DME and wet AMD.[2][4][5] All available materials focus on biologic drug development and clinical trials, with no mention of AI, machine learning, or computational drug discovery as a core product or feature; therefore, there is </w:t>
-            </w:r>
-            <w:r>
-              <w:rPr>
-                <w:rFonts w:ascii="Sora" w:hAnsi="Sora"/>
-                <w:b/>
-                <w:caps w:val="0"/>
-                <w:color w:val="3C3C3C"/>
-                <w:sz w:val="18"/>
-              </w:rPr>
-              <w:t>no evidence of AI</w:t>
-            </w:r>
-            <w:r>
-              <w:rPr>
-                <w:rFonts w:ascii="Sora" w:hAnsi="Sora"/>
-                <w:b w:val="0"/>
-                <w:caps w:val="0"/>
-                <w:color w:val="3C3C3C"/>
-                <w:sz w:val="18"/>
-              </w:rPr>
-              <w:t xml:space="preserve"> in the value proposition.[2][3][5]</w:t>
+              <w:t>Ollin is a clinical-stage biotech advancing therapies for retinal and vision-threatening diseases, focused on OLN324 for DME and wet AMD, with no mention of AI, machine learning, or computational drug discovery as part of the core product or platform in press releases or coverage.[1][3][4][5]</w:t>
             </w:r>
           </w:p>
         </w:tc>
@@ -389,7 +382,14 @@
       <w:tr>
         <w:tc>
           <w:tcPr>
-            <w:tcW w:type="dxa" w:w="2736"/>
+            <w:tcW w:type="dxa" w:w="2664"/>
+            <w:shd w:val="clear" w:color="auto" w:fill="F5F5F5"/>
+            <w:tcMar>
+              <w:top w:w="40" w:type="dxa"/>
+              <w:bottom w:w="40" w:type="dxa"/>
+              <w:left w:w="60" w:type="dxa"/>
+              <w:right w:w="60" w:type="dxa"/>
+            </w:tcMar>
             <w:tcBorders>
               <w:top w:val="nil"/>
               <w:left w:val="nil"/>
@@ -412,7 +412,14 @@
         </w:tc>
         <w:tc>
           <w:tcPr>
-            <w:tcW w:type="dxa" w:w="864"/>
+            <w:tcW w:type="dxa" w:w="792"/>
+            <w:shd w:val="clear" w:color="auto" w:fill="F5F5F5"/>
+            <w:tcMar>
+              <w:top w:w="40" w:type="dxa"/>
+              <w:bottom w:w="40" w:type="dxa"/>
+              <w:left w:w="60" w:type="dxa"/>
+              <w:right w:w="60" w:type="dxa"/>
+            </w:tcMar>
             <w:tcBorders>
               <w:top w:val="nil"/>
               <w:left w:val="nil"/>
@@ -424,18 +431,35 @@
             <w:r>
               <w:rPr>
                 <w:rFonts w:ascii="Sora" w:hAnsi="Sora"/>
-                <w:b w:val="0"/>
+                <w:b/>
                 <w:caps w:val="0"/>
                 <w:color w:val="1A1A1A"/>
                 <w:sz w:val="19"/>
               </w:rPr>
               <w:t>1</w:t>
             </w:r>
+            <w:r>
+              <w:rPr>
+                <w:rFonts w:ascii="Sora" w:hAnsi="Sora"/>
+                <w:b w:val="0"/>
+                <w:caps w:val="0"/>
+                <w:color w:val="828282"/>
+                <w:sz w:val="17"/>
+              </w:rPr>
+              <w:t xml:space="preserve"> / 4</w:t>
+            </w:r>
           </w:p>
         </w:tc>
         <w:tc>
           <w:tcPr>
-            <w:tcW w:type="dxa" w:w="6336"/>
+            <w:tcW w:type="dxa" w:w="5904"/>
+            <w:shd w:val="clear" w:color="auto" w:fill="F5F5F5"/>
+            <w:tcMar>
+              <w:top w:w="40" w:type="dxa"/>
+              <w:bottom w:w="40" w:type="dxa"/>
+              <w:left w:w="60" w:type="dxa"/>
+              <w:right w:w="60" w:type="dxa"/>
+            </w:tcMar>
             <w:tcBorders>
               <w:top w:val="nil"/>
               <w:left w:val="nil"/>
@@ -452,47 +476,7 @@
                 <w:color w:val="3C3C3C"/>
                 <w:sz w:val="18"/>
               </w:rPr>
-              <w:t xml:space="preserve">Ollin is explicitly </w:t>
-            </w:r>
-            <w:r>
-              <w:rPr>
-                <w:rFonts w:ascii="Sora" w:hAnsi="Sora"/>
-                <w:b/>
-                <w:caps w:val="0"/>
-                <w:color w:val="3C3C3C"/>
-                <w:sz w:val="18"/>
-              </w:rPr>
-              <w:t>clinical-stage</w:t>
-            </w:r>
-            <w:r>
-              <w:rPr>
-                <w:rFonts w:ascii="Sora" w:hAnsi="Sora"/>
-                <w:b w:val="0"/>
-                <w:caps w:val="0"/>
-                <w:color w:val="3C3C3C"/>
-                <w:sz w:val="18"/>
-              </w:rPr>
-              <w:t xml:space="preserve">, raising capital to fund global Phase 3 development of OLN324 and advance another candidate into the clinic.[2][4][5] There is </w:t>
-            </w:r>
-            <w:r>
-              <w:rPr>
-                <w:rFonts w:ascii="Sora" w:hAnsi="Sora"/>
-                <w:b/>
-                <w:caps w:val="0"/>
-                <w:color w:val="3C3C3C"/>
-                <w:sz w:val="18"/>
-              </w:rPr>
-              <w:t>no public disclosure</w:t>
-            </w:r>
-            <w:r>
-              <w:rPr>
-                <w:rFonts w:ascii="Sora" w:hAnsi="Sora"/>
-                <w:b w:val="0"/>
-                <w:caps w:val="0"/>
-                <w:color w:val="3C3C3C"/>
-                <w:sz w:val="18"/>
-              </w:rPr>
-              <w:t xml:space="preserve"> of commercial revenue, growth rate, NDR, LTV/CAC, or burn, and as a pre-commercial biotech it is highly unlikely to meet the rubric bars for &gt;$25M or &gt;$50M revenue and strong unit economics; with no quantitative fundamentals data available, this dimension must be scored low by the rubric’s instruction to avoid fabricating metrics.[2][3][5]</w:t>
+              <w:t>Public information describes Ollin as a clinical-stage biotech preparing global Phase 3 trials of OLN324 and does not provide any commercial revenue, growth, NDR, LTV/CAC, or burn metrics; the company appears pre-revenue and focused on R&amp;D and clinical development.[1][3][5][6]</w:t>
             </w:r>
           </w:p>
         </w:tc>
@@ -500,7 +484,14 @@
       <w:tr>
         <w:tc>
           <w:tcPr>
-            <w:tcW w:type="dxa" w:w="2736"/>
+            <w:tcW w:type="dxa" w:w="2664"/>
+            <w:shd w:val="clear" w:color="auto" w:fill="FFFFFF"/>
+            <w:tcMar>
+              <w:top w:w="40" w:type="dxa"/>
+              <w:bottom w:w="40" w:type="dxa"/>
+              <w:left w:w="60" w:type="dxa"/>
+              <w:right w:w="60" w:type="dxa"/>
+            </w:tcMar>
             <w:tcBorders>
               <w:top w:val="nil"/>
               <w:left w:val="nil"/>
@@ -523,7 +514,14 @@
         </w:tc>
         <w:tc>
           <w:tcPr>
-            <w:tcW w:type="dxa" w:w="864"/>
+            <w:tcW w:type="dxa" w:w="792"/>
+            <w:shd w:val="clear" w:color="auto" w:fill="FFFFFF"/>
+            <w:tcMar>
+              <w:top w:w="40" w:type="dxa"/>
+              <w:bottom w:w="40" w:type="dxa"/>
+              <w:left w:w="60" w:type="dxa"/>
+              <w:right w:w="60" w:type="dxa"/>
+            </w:tcMar>
             <w:tcBorders>
               <w:top w:val="nil"/>
               <w:left w:val="nil"/>
@@ -535,18 +533,35 @@
             <w:r>
               <w:rPr>
                 <w:rFonts w:ascii="Sora" w:hAnsi="Sora"/>
-                <w:b w:val="0"/>
+                <w:b/>
                 <w:caps w:val="0"/>
                 <w:color w:val="1A1A1A"/>
                 <w:sz w:val="19"/>
               </w:rPr>
               <w:t>3</w:t>
             </w:r>
+            <w:r>
+              <w:rPr>
+                <w:rFonts w:ascii="Sora" w:hAnsi="Sora"/>
+                <w:b w:val="0"/>
+                <w:caps w:val="0"/>
+                <w:color w:val="828282"/>
+                <w:sz w:val="17"/>
+              </w:rPr>
+              <w:t xml:space="preserve"> / 4</w:t>
+            </w:r>
           </w:p>
         </w:tc>
         <w:tc>
           <w:tcPr>
-            <w:tcW w:type="dxa" w:w="6336"/>
+            <w:tcW w:type="dxa" w:w="5904"/>
+            <w:shd w:val="clear" w:color="auto" w:fill="FFFFFF"/>
+            <w:tcMar>
+              <w:top w:w="40" w:type="dxa"/>
+              <w:bottom w:w="40" w:type="dxa"/>
+              <w:left w:w="60" w:type="dxa"/>
+              <w:right w:w="60" w:type="dxa"/>
+            </w:tcMar>
             <w:tcBorders>
               <w:top w:val="nil"/>
               <w:left w:val="nil"/>
@@ -563,47 +578,7 @@
                 <w:color w:val="3C3C3C"/>
                 <w:sz w:val="18"/>
               </w:rPr>
-              <w:t xml:space="preserve">The $330M oversubscribed Series B, top-tier crossover syndicate (including TCGX, ARCH, a16z Bio+Health, RA Capital, CPP Investments, Blackstone, and T. Rowe Price), and progression into </w:t>
-            </w:r>
-            <w:r>
-              <w:rPr>
-                <w:rFonts w:ascii="Sora" w:hAnsi="Sora"/>
-                <w:b/>
-                <w:caps w:val="0"/>
-                <w:color w:val="3C3C3C"/>
-                <w:sz w:val="18"/>
-              </w:rPr>
-              <w:t>global Phase 3 trials</w:t>
-            </w:r>
-            <w:r>
-              <w:rPr>
-                <w:rFonts w:ascii="Sora" w:hAnsi="Sora"/>
-                <w:b w:val="0"/>
-                <w:caps w:val="0"/>
-                <w:color w:val="3C3C3C"/>
-                <w:sz w:val="18"/>
-              </w:rPr>
-              <w:t xml:space="preserve"> for a Vabysmo-challenger bispecific antibody indicate a credible path to a multi-billion-dollar ophthalmology franchise if Phase 3 results are successful.[3][4][5] However, as with all late-stage biotech, there remains substantial clinical, regulatory, and commercialization risk, implying </w:t>
-            </w:r>
-            <w:r>
-              <w:rPr>
-                <w:rFonts w:ascii="Sora" w:hAnsi="Sora"/>
-                <w:b/>
-                <w:caps w:val="0"/>
-                <w:color w:val="3C3C3C"/>
-                <w:sz w:val="18"/>
-              </w:rPr>
-              <w:t>&gt;3x upside potential with meaningful risk of capital loss</w:t>
-            </w:r>
-            <w:r>
-              <w:rPr>
-                <w:rFonts w:ascii="Sora" w:hAnsi="Sora"/>
-                <w:b w:val="0"/>
-                <w:caps w:val="0"/>
-                <w:color w:val="3C3C3C"/>
-                <w:sz w:val="18"/>
-              </w:rPr>
-              <w:t>, which aligns with a score of 3 rather than the low-risk 7x+ profile of score 4.[3][5]</w:t>
+              <w:t>The $330M oversubscribed Series B to fund global Phase 3 programs in large-market indications (DME and wet AMD) with a strong blue-chip investor syndicate (ARCH, TCGX, T. Rowe Price, Blackstone MAI, RA Capital, Monograph) suggests significant upside if OLN324 succeeds, but with typical high binary risk of Phase 3 biotech outcomes and capital loss, aligning with &gt;3x potential with some risk of capital loss.[1][3][4][6]</w:t>
             </w:r>
           </w:p>
         </w:tc>
@@ -611,7 +586,14 @@
       <w:tr>
         <w:tc>
           <w:tcPr>
-            <w:tcW w:type="dxa" w:w="2736"/>
+            <w:tcW w:type="dxa" w:w="2664"/>
+            <w:shd w:val="clear" w:color="auto" w:fill="F5F5F5"/>
+            <w:tcMar>
+              <w:top w:w="40" w:type="dxa"/>
+              <w:bottom w:w="40" w:type="dxa"/>
+              <w:left w:w="60" w:type="dxa"/>
+              <w:right w:w="60" w:type="dxa"/>
+            </w:tcMar>
             <w:tcBorders>
               <w:top w:val="nil"/>
               <w:left w:val="nil"/>
@@ -634,7 +616,14 @@
         </w:tc>
         <w:tc>
           <w:tcPr>
-            <w:tcW w:type="dxa" w:w="864"/>
+            <w:tcW w:type="dxa" w:w="792"/>
+            <w:shd w:val="clear" w:color="auto" w:fill="F5F5F5"/>
+            <w:tcMar>
+              <w:top w:w="40" w:type="dxa"/>
+              <w:bottom w:w="40" w:type="dxa"/>
+              <w:left w:w="60" w:type="dxa"/>
+              <w:right w:w="60" w:type="dxa"/>
+            </w:tcMar>
             <w:tcBorders>
               <w:top w:val="nil"/>
               <w:left w:val="nil"/>
@@ -646,18 +635,35 @@
             <w:r>
               <w:rPr>
                 <w:rFonts w:ascii="Sora" w:hAnsi="Sora"/>
-                <w:b w:val="0"/>
+                <w:b/>
                 <w:caps w:val="0"/>
                 <w:color w:val="1A1A1A"/>
                 <w:sz w:val="19"/>
               </w:rPr>
-              <w:t>2</w:t>
+              <w:t>1</w:t>
+            </w:r>
+            <w:r>
+              <w:rPr>
+                <w:rFonts w:ascii="Sora" w:hAnsi="Sora"/>
+                <w:b w:val="0"/>
+                <w:caps w:val="0"/>
+                <w:color w:val="828282"/>
+                <w:sz w:val="17"/>
+              </w:rPr>
+              <w:t xml:space="preserve"> / 4</w:t>
             </w:r>
           </w:p>
         </w:tc>
         <w:tc>
           <w:tcPr>
-            <w:tcW w:type="dxa" w:w="6336"/>
+            <w:tcW w:type="dxa" w:w="5904"/>
+            <w:shd w:val="clear" w:color="auto" w:fill="F5F5F5"/>
+            <w:tcMar>
+              <w:top w:w="40" w:type="dxa"/>
+              <w:bottom w:w="40" w:type="dxa"/>
+              <w:left w:w="60" w:type="dxa"/>
+              <w:right w:w="60" w:type="dxa"/>
+            </w:tcMar>
             <w:tcBorders>
               <w:top w:val="nil"/>
               <w:left w:val="nil"/>
@@ -674,47 +680,7 @@
                 <w:color w:val="3C3C3C"/>
                 <w:sz w:val="18"/>
               </w:rPr>
-              <w:t xml:space="preserve">Public announcements describe the financing only as an </w:t>
-            </w:r>
-            <w:r>
-              <w:rPr>
-                <w:rFonts w:ascii="Sora" w:hAnsi="Sora"/>
-                <w:b/>
-                <w:caps w:val="0"/>
-                <w:color w:val="3C3C3C"/>
-                <w:sz w:val="18"/>
-              </w:rPr>
-              <w:t>oversubscribed $330M Series B</w:t>
-            </w:r>
-            <w:r>
-              <w:rPr>
-                <w:rFonts w:ascii="Sora" w:hAnsi="Sora"/>
-                <w:b w:val="0"/>
-                <w:caps w:val="0"/>
-                <w:color w:val="3C3C3C"/>
-                <w:sz w:val="18"/>
-              </w:rPr>
-              <w:t xml:space="preserve"> with named leads and a broad crossover syndicate, but provide </w:t>
-            </w:r>
-            <w:r>
-              <w:rPr>
-                <w:rFonts w:ascii="Sora" w:hAnsi="Sora"/>
-                <w:b/>
-                <w:caps w:val="0"/>
-                <w:color w:val="3C3C3C"/>
-                <w:sz w:val="18"/>
-              </w:rPr>
-              <w:t>no detail</w:t>
-            </w:r>
-            <w:r>
-              <w:rPr>
-                <w:rFonts w:ascii="Sora" w:hAnsi="Sora"/>
-                <w:b w:val="0"/>
-                <w:caps w:val="0"/>
-                <w:color w:val="3C3C3C"/>
-                <w:sz w:val="18"/>
-              </w:rPr>
-              <w:t xml:space="preserve"> on SPV structure, carry, management fees, or specific time horizon/data access for prospective co-investors.[2][3][5] In the absence of explicit terms information, and given it is a standard large institutional Series B rather than a bespoke 0/10 SPV, the conservative rubric application is to assign a low-mid score reflecting generic market terms rather than specially favorable economics.[2][3][5]</w:t>
+              <w:t>No public information was found on SPV structure, carry, management fees, time horizon, or data access specific to this opportunity; only the company-side financing terms and investor list are disclosed, so there is no basis to assess ID8’s entry terms.[1][3][6]</w:t>
             </w:r>
           </w:p>
         </w:tc>
@@ -722,24 +688,30 @@
     </w:tbl>
     <w:p>
       <w:pPr>
-        <w:spacing w:after="80"/>
+        <w:spacing w:after="160"/>
       </w:pPr>
     </w:p>
     <w:p>
+      <w:pPr>
+        <w:spacing w:after="120"/>
+        <w:pBdr>
+          <w:bottom w:val="single" w:sz="6" w:color="1A1A1A" w:space="4"/>
+        </w:pBdr>
+      </w:pPr>
       <w:r>
         <w:rPr>
-          <w:rFonts w:ascii="Sora" w:hAnsi="Sora"/>
+          <w:rFonts w:ascii="Roboto Serif" w:hAnsi="Roboto Serif"/>
           <w:b/>
-          <w:caps/>
-          <w:color w:val="828282"/>
-          <w:sz w:val="17"/>
+          <w:caps w:val="0"/>
+          <w:color w:val="1A1A1A"/>
+          <w:sz w:val="24"/>
         </w:rPr>
         <w:t>RATIONALE</w:t>
       </w:r>
     </w:p>
     <w:p>
       <w:pPr>
-        <w:spacing w:after="360"/>
+        <w:spacing w:before="120" w:after="120"/>
         <w:jc w:val="both"/>
       </w:pPr>
       <w:r>
@@ -750,145 +722,168 @@
           <w:color w:val="1A1A1A"/>
           <w:sz w:val="21"/>
         </w:rPr>
-        <w:t xml:space="preserve">The deal is </w:t>
-      </w:r>
-      <w:r>
-        <w:rPr>
-          <w:rFonts w:ascii="Sora" w:hAnsi="Sora"/>
-          <w:b/>
-          <w:caps w:val="0"/>
-          <w:color w:val="1A1A1A"/>
-          <w:sz w:val="21"/>
-        </w:rPr>
-        <w:t>in scope</w:t>
-      </w:r>
-      <w:r>
-        <w:rPr>
-          <w:rFonts w:ascii="Sora" w:hAnsi="Sora"/>
-          <w:b w:val="0"/>
-          <w:caps w:val="0"/>
-          <w:color w:val="1A1A1A"/>
-          <w:sz w:val="21"/>
-        </w:rPr>
-        <w:t xml:space="preserve"> on both gates: it is a </w:t>
-      </w:r>
-      <w:r>
-        <w:rPr>
-          <w:rFonts w:ascii="Sora" w:hAnsi="Sora"/>
-          <w:b/>
-          <w:caps w:val="0"/>
-          <w:color w:val="1A1A1A"/>
-          <w:sz w:val="21"/>
-        </w:rPr>
-        <w:t>Series B</w:t>
-      </w:r>
-      <w:r>
-        <w:rPr>
-          <w:rFonts w:ascii="Sora" w:hAnsi="Sora"/>
-          <w:b w:val="0"/>
-          <w:caps w:val="0"/>
-          <w:color w:val="1A1A1A"/>
-          <w:sz w:val="21"/>
-        </w:rPr>
-        <w:t xml:space="preserve"> round and Ollin is headquartered in </w:t>
-      </w:r>
-      <w:r>
-        <w:rPr>
-          <w:rFonts w:ascii="Sora" w:hAnsi="Sora"/>
-          <w:b/>
-          <w:caps w:val="0"/>
-          <w:color w:val="1A1A1A"/>
-          <w:sz w:val="21"/>
-        </w:rPr>
-        <w:t>Austin, Texas (North America)</w:t>
-      </w:r>
-      <w:r>
-        <w:rPr>
-          <w:rFonts w:ascii="Sora" w:hAnsi="Sora"/>
-          <w:b w:val="0"/>
-          <w:caps w:val="0"/>
-          <w:color w:val="1A1A1A"/>
-          <w:sz w:val="21"/>
-        </w:rPr>
-        <w:t xml:space="preserve">.[2][3] It aligns strongly with ID8’s thesis on lead/round dynamics, as the $330M primary Series B is co-led by </w:t>
-      </w:r>
-      <w:r>
-        <w:rPr>
-          <w:rFonts w:ascii="Sora" w:hAnsi="Sora"/>
-          <w:b/>
-          <w:caps w:val="0"/>
-          <w:color w:val="1A1A1A"/>
-          <w:sz w:val="21"/>
-        </w:rPr>
-        <w:t>new-money Tier 1 investor TCGX</w:t>
-      </w:r>
-      <w:r>
-        <w:rPr>
-          <w:rFonts w:ascii="Sora" w:hAnsi="Sora"/>
-          <w:b w:val="0"/>
-          <w:caps w:val="0"/>
-          <w:color w:val="1A1A1A"/>
-          <w:sz w:val="21"/>
-        </w:rPr>
-        <w:t xml:space="preserve"> alongside inside founding investor ARCH, and supported by a top-tier crossover syndicate including a16z Bio+Health, RA Capital, CPP Investments, Blackstone, and T. Rowe Price, though the presence of an inside co-lead keeps it just below the ideal pure new-money top-tier lead definition.[3][5] Fundamentals are inherently weak/unknown as a pre-commercial clinical-stage biotech, and there is no AI component, but the oversubscribed, Phase 3–stage ophthalmology program backed by leading healthcare investors supports a high-upside (&gt;3x) but high-risk return profile; terms cannot be evaluated beyond generic assumptions due to lack of public detail.[2][3][5]</w:t>
+        <w:t>The deal passes both gates: it is a large Series B round and Ollin is headquartered in Austin, TX (North America), so it is in-scope.[1][3] It partially aligns with ID8’s thesis in that a Tier 1 crossover investor (TCGX) is joining as a new-money co-lead at Series B alongside existing Tier 1 ARCH, supported by a strong late-stage biotech syndicate, but it is not a clean single new-money Tier 1 lead. Overall fit is moderate: strong round dynamics and upside in a big ophthalmology market, but no AI component, limited visibility on fundamentals beyond being clinical-stage/pre-revenue, and no information on ID8-specific terms.</w:t>
       </w:r>
     </w:p>
     <w:p>
+      <w:pPr>
+        <w:spacing w:before="80"/>
+      </w:pPr>
       <w:r>
         <w:rPr>
           <w:rFonts w:ascii="Sora" w:hAnsi="Sora"/>
           <w:b w:val="0"/>
           <w:caps w:val="0"/>
           <w:color w:val="828282"/>
-          <w:sz w:val="17"/>
+          <w:sz w:val="18"/>
         </w:rPr>
-        <w:t>Confidence: medium   ·   Screened 2026-06-29   ·   ID8 Investments — Confidential</w:t>
-      </w:r>
-    </w:p>
-    <w:p>
-      <w:r>
-        <w:drawing>
-          <wp:inline xmlns:a="http://schemas.openxmlformats.org/drawingml/2006/main" xmlns:pic="http://schemas.openxmlformats.org/drawingml/2006/picture">
-            <wp:extent cx="731520" cy="72277"/>
-            <wp:docPr id="1" name="Picture 1"/>
-            <wp:cNvGraphicFramePr>
-              <a:graphicFrameLocks noChangeAspect="1"/>
-            </wp:cNvGraphicFramePr>
-            <a:graphic>
-              <a:graphicData uri="http://schemas.openxmlformats.org/drawingml/2006/picture">
-                <pic:pic>
-                  <pic:nvPicPr>
-                    <pic:cNvPr id="0" name="id8_charcoal.png"/>
-                    <pic:cNvPicPr/>
-                  </pic:nvPicPr>
-                  <pic:blipFill>
-                    <a:blip r:embed="rId9"/>
-                    <a:stretch>
-                      <a:fillRect/>
-                    </a:stretch>
-                  </pic:blipFill>
-                  <pic:spPr>
-                    <a:xfrm>
-                      <a:off x="0" y="0"/>
-                      <a:ext cx="731520" cy="72277"/>
-                    </a:xfrm>
-                    <a:prstGeom prst="rect"/>
-                  </pic:spPr>
-                </pic:pic>
-              </a:graphicData>
-            </a:graphic>
-          </wp:inline>
-        </w:drawing>
+        <w:t>Confidence: medium</w:t>
       </w:r>
     </w:p>
     <w:sectPr>
+      <w:footerReference w:type="default" r:id="rId9"/>
+      <w:headerReference w:type="default" r:id="rId10"/>
       <w:pgSz w:w="12240" w:h="15840"/>
-      <w:pgMar w:top="1080" w:right="1296" w:bottom="1080" w:left="1296" w:header="720" w:footer="720" w:gutter="0"/>
+      <w:pgMar w:top="1440" w:right="1440" w:bottom="1440" w:left="1440" w:header="720" w:footer="720" w:gutter="0"/>
       <w:cols w:space="720"/>
       <w:docGrid w:linePitch="360"/>
     </w:sectPr>
   </w:body>
 </w:document>
+</file>
+
+<file path=word/footer1.xml><?xml version="1.0" encoding="utf-8"?>
+<w:ftr xmlns:m="http://schemas.openxmlformats.org/officeDocument/2006/math" xmlns:mc="http://schemas.openxmlformats.org/markup-compatibility/2006" xmlns:mo="http://schemas.microsoft.com/office/mac/office/2008/main" xmlns:mv="urn:schemas-microsoft-com:mac:vml" xmlns:o="urn:schemas-microsoft-com:office:office" xmlns:r="http://schemas.openxmlformats.org/officeDocument/2006/relationships" xmlns:v="urn:schemas-microsoft-com:vml" xmlns:w10="urn:schemas-microsoft-com:office:word" xmlns:w14="http://schemas.microsoft.com/office/word/2010/wordml" xmlns:w="http://schemas.openxmlformats.org/wordprocessingml/2006/main" xmlns:wne="http://schemas.microsoft.com/office/word/2006/wordml" xmlns:wp14="http://schemas.microsoft.com/office/word/2010/wordprocessingDrawing" xmlns:wp="http://schemas.openxmlformats.org/drawingml/2006/wordprocessingDrawing" xmlns:wpc="http://schemas.microsoft.com/office/word/2010/wordprocessingCanvas" xmlns:wpg="http://schemas.microsoft.com/office/word/2010/wordprocessingGroup" xmlns:wpi="http://schemas.microsoft.com/office/word/2010/wordprocessingInk" xmlns:wps="http://schemas.microsoft.com/office/word/2010/wordprocessingShape" mc:Ignorable="w14 wp14">
+  <w:p>
+    <w:pPr>
+      <w:pStyle w:val="Footer"/>
+      <w:jc w:val="center"/>
+    </w:pPr>
+    <w:r>
+      <w:rPr>
+        <w:rFonts w:ascii="Sora" w:hAnsi="Sora"/>
+        <w:b w:val="0"/>
+        <w:caps w:val="0"/>
+        <w:color w:val="828282"/>
+        <w:sz w:val="17"/>
+      </w:rPr>
+      <w:t xml:space="preserve">Page </w:t>
+    </w:r>
+    <w:fldChar w:fldCharType="begin"/>
+    <w:instrText xml:space="preserve"> PAGE </w:instrText>
+    <w:fldChar w:fldCharType="end"/>
+    <w:r>
+      <w:rPr>
+        <w:rFonts w:ascii="Sora" w:hAnsi="Sora"/>
+        <w:b w:val="0"/>
+        <w:caps w:val="0"/>
+        <w:color w:val="828282"/>
+        <w:sz w:val="17"/>
+      </w:rPr>
+      <w:t xml:space="preserve"> of </w:t>
+    </w:r>
+    <w:fldChar w:fldCharType="begin"/>
+    <w:instrText xml:space="preserve"> NUMPAGES </w:instrText>
+    <w:fldChar w:fldCharType="end"/>
+  </w:p>
+</w:ftr>
+</file>
+
+<file path=word/header1.xml><?xml version="1.0" encoding="utf-8"?>
+<w:hdr xmlns:m="http://schemas.openxmlformats.org/officeDocument/2006/math" xmlns:mc="http://schemas.openxmlformats.org/markup-compatibility/2006" xmlns:mo="http://schemas.microsoft.com/office/mac/office/2008/main" xmlns:mv="urn:schemas-microsoft-com:mac:vml" xmlns:o="urn:schemas-microsoft-com:office:office" xmlns:r="http://schemas.openxmlformats.org/officeDocument/2006/relationships" xmlns:v="urn:schemas-microsoft-com:vml" xmlns:w10="urn:schemas-microsoft-com:office:word" xmlns:w14="http://schemas.microsoft.com/office/word/2010/wordml" xmlns:w="http://schemas.openxmlformats.org/wordprocessingml/2006/main" xmlns:wne="http://schemas.microsoft.com/office/word/2006/wordml" xmlns:wp14="http://schemas.microsoft.com/office/word/2010/wordprocessingDrawing" xmlns:wp="http://schemas.openxmlformats.org/drawingml/2006/wordprocessingDrawing" xmlns:wpc="http://schemas.microsoft.com/office/word/2010/wordprocessingCanvas" xmlns:wpg="http://schemas.microsoft.com/office/word/2010/wordprocessingGroup" xmlns:wpi="http://schemas.microsoft.com/office/word/2010/wordprocessingInk" xmlns:wps="http://schemas.microsoft.com/office/word/2010/wordprocessingShape" mc:Ignorable="w14 wp14">
+  <w:p>
+    <w:pPr>
+      <w:pStyle w:val="Header"/>
+    </w:pPr>
+  </w:p>
+  <w:tbl>
+    <w:tblPr>
+      <w:tblW w:type="auto" w:w="0"/>
+      <w:tblLayout w:type="fixed"/>
+      <w:tblLook w:firstColumn="1" w:firstRow="1" w:lastColumn="0" w:lastRow="0" w:noHBand="0" w:noVBand="1" w:val="04A0"/>
+    </w:tblPr>
+    <w:tblGrid>
+      <w:gridCol w:w="1440"/>
+      <w:gridCol w:w="7920"/>
+    </w:tblGrid>
+    <w:tr>
+      <w:tc>
+        <w:tcPr>
+          <w:tcW w:type="dxa" w:w="4680"/>
+          <w:tcBorders>
+            <w:top w:val="nil"/>
+            <w:left w:val="nil"/>
+            <w:right w:val="nil"/>
+            <w:bottom w:val="single" w:sz="4" w:color="1A1A1A"/>
+          </w:tcBorders>
+        </w:tcPr>
+        <w:p>
+          <w:r>
+            <w:drawing>
+              <wp:inline xmlns:a="http://schemas.openxmlformats.org/drawingml/2006/main" xmlns:pic="http://schemas.openxmlformats.org/drawingml/2006/picture">
+                <wp:extent cx="594360" cy="58725"/>
+                <wp:docPr id="1" name="Picture 1"/>
+                <wp:cNvGraphicFramePr>
+                  <a:graphicFrameLocks noChangeAspect="1"/>
+                </wp:cNvGraphicFramePr>
+                <a:graphic>
+                  <a:graphicData uri="http://schemas.openxmlformats.org/drawingml/2006/picture">
+                    <pic:pic>
+                      <pic:nvPicPr>
+                        <pic:cNvPr id="0" name="id8_charcoal.png"/>
+                        <pic:cNvPicPr/>
+                      </pic:nvPicPr>
+                      <pic:blipFill>
+                        <a:blip r:embed="rId1"/>
+                        <a:stretch>
+                          <a:fillRect/>
+                        </a:stretch>
+                      </pic:blipFill>
+                      <pic:spPr>
+                        <a:xfrm>
+                          <a:off x="0" y="0"/>
+                          <a:ext cx="594360" cy="58725"/>
+                        </a:xfrm>
+                        <a:prstGeom prst="rect"/>
+                      </pic:spPr>
+                    </pic:pic>
+                  </a:graphicData>
+                </a:graphic>
+              </wp:inline>
+            </w:drawing>
+          </w:r>
+        </w:p>
+      </w:tc>
+      <w:tc>
+        <w:tcPr>
+          <w:tcW w:type="dxa" w:w="4680"/>
+          <w:tcBorders>
+            <w:top w:val="nil"/>
+            <w:left w:val="nil"/>
+            <w:right w:val="nil"/>
+            <w:bottom w:val="single" w:sz="4" w:color="1A1A1A"/>
+          </w:tcBorders>
+        </w:tcPr>
+        <w:p>
+          <w:pPr>
+            <w:spacing w:before="80"/>
+            <w:jc w:val="right"/>
+          </w:pPr>
+          <w:r>
+            <w:rPr>
+              <w:rFonts w:ascii="Sora" w:hAnsi="Sora"/>
+              <w:b w:val="0"/>
+              <w:caps/>
+              <w:color w:val="828282"/>
+              <w:sz w:val="16"/>
+            </w:rPr>
+            <w:t>DEAL SCREEN  ·  ID8 INVESTMENTS  ·  CONFIDENTIAL</w:t>
+          </w:r>
+        </w:p>
+      </w:tc>
+    </w:tr>
+  </w:tbl>
+</w:hdr>
 </file>
 
 <file path=word/numbering.xml><?xml version="1.0" encoding="utf-8"?>

</xml_diff>